<commit_message>
Align CVRDE demo with approved review scope
</commit_message>
<xml_diff>
--- a/docs/BiztelAI_CVRDE_PLAN.docx
+++ b/docs/BiztelAI_CVRDE_PLAN.docx
@@ -19244,6 +19244,56 @@
       </w:pPr>
       <w:r>
         <w:t>Session cookie chosen over JWT; login rate limit; CSV formula escaping; reassignment email to both owners; on-premises portability notes.</w:t>
+      </w:r>
+    </w:p>
+    <w:p>
+      <w:r>
+        <w:t xml:space="preserve">Revision 5 — Approved CVRDE fictional demo scope (Issue #18)</w:t>
+      </w:r>
+    </w:p>
+    <w:p>
+      <w:r>
+        <w:t xml:space="preserve">Project structure: Project → Sub-project → Task. Only the PM creates or edits sub-project name, Objective, due date, and owner. Objective helper: What this sub-project must deliver. The sub-project owner creates and assigns tasks, reviews results, and runs meetings.</w:t>
+      </w:r>
+    </w:p>
+    <w:p>
+      <w:r>
+        <w:t xml:space="preserve">Eight-step story: PM overview; sub-project owner assignment; task owner evidence and submission; return with reason; correction and resubmission; sign-off and progress; PM meeting action; action task in owner's My work with assignment notification.</w:t>
+      </w:r>
+    </w:p>
+    <w:p>
+      <w:r>
+        <w:t xml:space="preserve">Task history is shown as sentences. The real organisation name appears once in the sidebar. Due dates have one format and relative labels. A project switcher is optional for the one-project demo.</w:t>
+      </w:r>
+    </w:p>
+    <w:p>
+      <w:r>
+        <w:t xml:space="preserve">At-risk rules: overdue open work, Not started work due within three days, stale work, and explicit risk flags. Stale excludes Done and Submitted. Submitted overdue work reads Overdue, awaiting review. Reset seed: Crankshaft stress analysis is overdue, Friction loss estimation is Not started and due in two days, Cooling jacket design is stale.</w:t>
+      </w:r>
+    </w:p>
+    <w:p>
+      <w:r>
+        <w:t xml:space="preserve">My work Due this week covers today through today plus six days. Anyone permitted to view a task may comment, including other task owners in its sub-project.</w:t>
+      </w:r>
+    </w:p>
+    <w:p>
+      <w:r>
+        <w:t xml:space="preserve">Demo UI hides groups, reassignment and extension requests, prerequisites, and Linked to. Their schema and APIs remain. VITE_DEMO_MODE=false at frontend build time restores these controls.</w:t>
+      </w:r>
+    </w:p>
+    <w:p>
+      <w:r>
+        <w:t xml:space="preserve">Phase 4 notifications: bell and email use the existing notify() and notification_log after commit. Hosted demo email is redirected to one team inbox. Assignment, submission, return, resubmission, sign-off, and meeting action each require a live delivery check after Resend settings are configured.</w:t>
+      </w:r>
+    </w:p>
+    <w:p>
+      <w:r>
+        <w:t xml:space="preserve">Known gaps: no PM-owned tasks in demo seed; My submissions exists but Submitted in My work supports the walkthrough; attachments remain in PostgreSQL pending object storage for on-premise. Roadmap: milestones, minutes approval, TRL tracking, multi-level review, on-premise deployment.</w:t>
+      </w:r>
+    </w:p>
+    <w:p>
+      <w:r>
+        <w:t xml:space="preserve">Current hosted email verification awaits RESEND_API_KEY, RESEND_FROM, EMAIL_REDIRECT_TO, EMAIL_ENABLED=true, EMAIL_PROVIDER=resend, and PUBLIC_APP_URL in deployment settings. Never store secrets in this plan.</w:t>
       </w:r>
     </w:p>
     <w:sectPr>

</xml_diff>